<commit_message>
correcion documentos teoricos, generadores, casos de prueba y api weather)
</commit_message>
<xml_diff>
--- a/tp-calidad-sistema/Informe_Final_Consigna7.docx
+++ b/tp-calidad-sistema/Informe_Final_Consigna7.docx
@@ -2282,35 +2282,35 @@
                 <w:sz w:val="19"/>
                 <w:szCs w:val="19"/>
               </w:rPr>
-              <w:t xml:space="preserve">15</w:t>
+              <w:t xml:space="preserve">11</w:t>
             </w:r>
           </w:p>
         </w:tc>
         <w:tc>
           <w:tcPr>
             <w:tcW w:type="dxa" w:w="1900"/>
-            <w:shd w:fill="DCFCE7" w:color="auto" w:val="clear"/>
-            <w:tcMar>
-              <w:top w:type="dxa" w:w="60"/>
-              <w:left w:type="dxa" w:w="100"/>
-              <w:bottom w:type="dxa" w:w="60"/>
-              <w:right w:type="dxa" w:w="100"/>
-            </w:tcMar>
-            <w:vAlign w:val="center"/>
-          </w:tcPr>
-          <w:p>
-            <w:pPr>
-              <w:jc w:val="left"/>
-            </w:pPr>
-            <w:r>
-              <w:rPr>
-                <w:b w:val="false"/>
-                <w:bCs w:val="false"/>
-                <w:color w:val="166534"/>
-                <w:sz w:val="19"/>
-                <w:szCs w:val="19"/>
-              </w:rPr>
-              <w:t xml:space="preserve">0</w:t>
+            <w:shd w:fill="FEE2E2" w:color="auto" w:val="clear"/>
+            <w:tcMar>
+              <w:top w:type="dxa" w:w="60"/>
+              <w:left w:type="dxa" w:w="100"/>
+              <w:bottom w:type="dxa" w:w="60"/>
+              <w:right w:type="dxa" w:w="100"/>
+            </w:tcMar>
+            <w:vAlign w:val="center"/>
+          </w:tcPr>
+          <w:p>
+            <w:pPr>
+              <w:jc w:val="left"/>
+            </w:pPr>
+            <w:r>
+              <w:rPr>
+                <w:b w:val="false"/>
+                <w:bCs w:val="false"/>
+                <w:color w:val="991B1B"/>
+                <w:sz w:val="19"/>
+                <w:szCs w:val="19"/>
+              </w:rPr>
+              <w:t xml:space="preserve">3</w:t>
             </w:r>
           </w:p>
         </w:tc>
@@ -2338,7 +2338,7 @@
                 <w:sz w:val="19"/>
                 <w:szCs w:val="19"/>
               </w:rPr>
-              <w:t xml:space="preserve">0</w:t>
+              <w:t xml:space="preserve">1</w:t>
             </w:r>
           </w:p>
         </w:tc>
@@ -2366,7 +2366,7 @@
                 <w:sz w:val="19"/>
                 <w:szCs w:val="19"/>
               </w:rPr>
-              <w:t xml:space="preserve">100 %</w:t>
+              <w:t xml:space="preserve">73 %</w:t>
             </w:r>
           </w:p>
         </w:tc>
@@ -2384,7 +2384,7 @@
           <w:sz w:val="19"/>
           <w:szCs w:val="19"/>
         </w:rPr>
-        <w:t xml:space="preserve">Nota: la primera corrida automatizada de esta suite reportó fallos puntuales atribuibles a selectores desactualizados frente a cambios en el DOM de OrangeHRM (timeouts de elementos, "strict mode violations" por selectores ambiguos y locators con índice incorrecto). Tras ajustar los scripts de prueba, la suite quedó estable en el resultado mostrado arriba — estos ajustes son de mantenimiento de la automatización, no defectos de producto.</w:t>
+        <w:t xml:space="preserve">Detalle: Fallaron: CP-002 (timeout esperando resultados de búsqueda — intermitente, atribuible a la lentitud del demo público compartido de OrangeHRM), CP-012 (assertion sobre alta de Work Experience) y CP-013 ("strict mode violation": el selector de la tarjeta Education matchea 6 elementos en el DOM actual — selector a refinar). Saltado: CP-003 (dependía del resultado de CP-002). CP-014 quedó "flaky" (falló en el primer intento por timing y pasó al reintentar).</w:t>
       </w:r>
     </w:p>
     <w:p>
@@ -3653,31 +3653,59 @@
                 <w:sz w:val="19"/>
                 <w:szCs w:val="19"/>
               </w:rPr>
-              <w:t xml:space="preserve">5</w:t>
+              <w:t xml:space="preserve">4</w:t>
             </w:r>
           </w:p>
         </w:tc>
         <w:tc>
           <w:tcPr>
             <w:tcW w:type="dxa" w:w="1900"/>
-            <w:shd w:fill="DCFCE7" w:color="auto" w:val="clear"/>
-            <w:tcMar>
-              <w:top w:type="dxa" w:w="60"/>
-              <w:left w:type="dxa" w:w="100"/>
-              <w:bottom w:type="dxa" w:w="60"/>
-              <w:right w:type="dxa" w:w="100"/>
-            </w:tcMar>
-            <w:vAlign w:val="center"/>
-          </w:tcPr>
-          <w:p>
-            <w:pPr>
-              <w:jc w:val="left"/>
-            </w:pPr>
-            <w:r>
-              <w:rPr>
-                <w:b w:val="false"/>
-                <w:bCs w:val="false"/>
-                <w:color w:val="166534"/>
+            <w:shd w:fill="FEE2E2" w:color="auto" w:val="clear"/>
+            <w:tcMar>
+              <w:top w:type="dxa" w:w="60"/>
+              <w:left w:type="dxa" w:w="100"/>
+              <w:bottom w:type="dxa" w:w="60"/>
+              <w:right w:type="dxa" w:w="100"/>
+            </w:tcMar>
+            <w:vAlign w:val="center"/>
+          </w:tcPr>
+          <w:p>
+            <w:pPr>
+              <w:jc w:val="left"/>
+            </w:pPr>
+            <w:r>
+              <w:rPr>
+                <w:b w:val="false"/>
+                <w:bCs w:val="false"/>
+                <w:color w:val="991B1B"/>
+                <w:sz w:val="19"/>
+                <w:szCs w:val="19"/>
+              </w:rPr>
+              <w:t xml:space="preserve">1</w:t>
+            </w:r>
+          </w:p>
+        </w:tc>
+        <w:tc>
+          <w:tcPr>
+            <w:tcW w:type="dxa" w:w="1900"/>
+            <w:shd w:fill="FFFFFF" w:color="auto" w:val="clear"/>
+            <w:tcMar>
+              <w:top w:type="dxa" w:w="60"/>
+              <w:left w:type="dxa" w:w="100"/>
+              <w:bottom w:type="dxa" w:w="60"/>
+              <w:right w:type="dxa" w:w="100"/>
+            </w:tcMar>
+            <w:vAlign w:val="center"/>
+          </w:tcPr>
+          <w:p>
+            <w:pPr>
+              <w:jc w:val="left"/>
+            </w:pPr>
+            <w:r>
+              <w:rPr>
+                <w:b w:val="false"/>
+                <w:bCs w:val="false"/>
+                <w:color w:val="1F2937"/>
                 <w:sz w:val="19"/>
                 <w:szCs w:val="19"/>
               </w:rPr>
@@ -3709,35 +3737,7 @@
                 <w:sz w:val="19"/>
                 <w:szCs w:val="19"/>
               </w:rPr>
-              <w:t xml:space="preserve">0</w:t>
-            </w:r>
-          </w:p>
-        </w:tc>
-        <w:tc>
-          <w:tcPr>
-            <w:tcW w:type="dxa" w:w="1900"/>
-            <w:shd w:fill="FFFFFF" w:color="auto" w:val="clear"/>
-            <w:tcMar>
-              <w:top w:type="dxa" w:w="60"/>
-              <w:left w:type="dxa" w:w="100"/>
-              <w:bottom w:type="dxa" w:w="60"/>
-              <w:right w:type="dxa" w:w="100"/>
-            </w:tcMar>
-            <w:vAlign w:val="center"/>
-          </w:tcPr>
-          <w:p>
-            <w:pPr>
-              <w:jc w:val="left"/>
-            </w:pPr>
-            <w:r>
-              <w:rPr>
-                <w:b w:val="false"/>
-                <w:bCs w:val="false"/>
-                <w:color w:val="1F2937"/>
-                <w:sz w:val="19"/>
-                <w:szCs w:val="19"/>
-              </w:rPr>
-              <w:t xml:space="preserve">100 %</w:t>
+              <w:t xml:space="preserve">80 %</w:t>
             </w:r>
           </w:p>
         </w:tc>
@@ -3755,7 +3755,7 @@
           <w:sz w:val="19"/>
           <w:szCs w:val="19"/>
         </w:rPr>
-        <w:t xml:space="preserve">Nota: la primera corrida automatizada de esta suite reportó fallos puntuales atribuibles a selectores desactualizados frente a cambios en el DOM de OrangeHRM (timeouts de elementos, "strict mode violations" por selectores ambiguos y locators con índice incorrecto). Tras ajustar los scripts de prueba, la suite quedó estable en el resultado mostrado arriba — estos ajustes son de mantenimiento de la automatización, no defectos de producto.</w:t>
+        <w:t xml:space="preserve">Detalle: Falló CP-019 (assertion sobre el cierre del formulario de supervisor vía Cancel — el valor del campo no quedó vacío como se esperaba; a confirmar si es comportamiento real de la pantalla o un timing de la automatización).</w:t>
       </w:r>
     </w:p>
     <w:p>
@@ -4842,7 +4842,7 @@
           <w:sz w:val="19"/>
           <w:szCs w:val="19"/>
         </w:rPr>
-        <w:t xml:space="preserve">Nota: la primera corrida automatizada de esta suite reportó fallos puntuales atribuibles a selectores desactualizados frente a cambios en el DOM de OrangeHRM (timeouts de elementos, "strict mode violations" por selectores ambiguos y locators con índice incorrecto). Tras ajustar los scripts de prueba, la suite quedó estable en el resultado mostrado arriba — estos ajustes son de mantenimiento de la automatización, no defectos de producto.</w:t>
+        <w:t xml:space="preserve">Detalle: Los 5 casos pasaron sin incidentes en la última corrida.</w:t>
       </w:r>
     </w:p>
     <w:p>
@@ -5533,7 +5533,7 @@
                 <w:sz w:val="19"/>
                 <w:szCs w:val="19"/>
               </w:rPr>
-              <w:t xml:space="preserve">API key inválida retorna 403 Forbidden</w:t>
+              <w:t xml:space="preserve">API key inválida retorna 401 Unauthorized</w:t>
             </w:r>
           </w:p>
         </w:tc>
@@ -6819,7 +6819,7 @@
           <w:sz w:val="21"/>
           <w:szCs w:val="21"/>
         </w:rPr>
-        <w:t xml:space="preserve">Ejecución manual: importar ambos archivos en Postman Desktop, seleccionar el entorno "WeatherAPI" y correr la colección completa con el Collection Runner.</w:t>
+        <w:t xml:space="preserve">Ejecución manual: importar ambos archivos en Postman Desktop, seleccionar el entorno "WeatherAPI - Entorno de Pruebas" y, antes de correr, pegar la API key real en la variable api_key (el valor de fábrica "{{$processEnv WEATHER_API_KEY}}" es solo un recordatorio: no se resuelve de forma recursiva al usarse como valor estático de otra variable). Luego ejecutar la colección con el Collection Runner.</w:t>
       </w:r>
     </w:p>
     <w:p>
@@ -6836,7 +6836,7 @@
           <w:sz w:val="21"/>
           <w:szCs w:val="21"/>
         </w:rPr>
-        <w:t xml:space="preserve">Ejecución automatizada: el servicio "api-tests" del docker-compose corre la colección con Newman (npx newman run WeatherAPI.postman_collection.json -e WeatherAPI.postman_environment.json), generando un reporte que se centraliza junto con el resto de los resultados en Allure.</w:t>
+        <w:t xml:space="preserve">Ejecución automatizada (100% en Docker): el servicio "api-tests" corre "docker compose run --rm api-tests" → "newman run collections/WeatherAPI.postman_collection.json --environment collections/WeatherAPI.postman_environment.json --env-var \"api_key=$WEATHER_API_KEY\" --insecure --reporters cli,htmlextra ...". El flag --env-var inyecta la key real desde .env (evitando el problema del placeholder) y --insecure evita el error "self-signed certificate in certificate chain" que produce la inspección HTTPS de la red. El reporte HTML resultante se centraliza junto con el resto de los resultados en Allure / http://localhost:8080/api-report/.</w:t>
       </w:r>
     </w:p>
     <w:p>
@@ -6906,6 +6906,21 @@
           <w:szCs w:val="24"/>
         </w:rPr>
         <w:t xml:space="preserve">1. Resumen consolidado de ejecución</w:t>
+      </w:r>
+    </w:p>
+    <w:p>
+      <w:pPr>
+        <w:spacing w:after="120"/>
+      </w:pPr>
+      <w:r>
+        <w:rPr>
+          <w:i/>
+          <w:iCs/>
+          <w:color w:val="6B7280"/>
+          <w:sz w:val="19"/>
+          <w:szCs w:val="19"/>
+        </w:rPr>
+        <w:t xml:space="preserve">Números tomados de la última corrida real registrada en playwright-report/results.json (ejecutada con "docker compose run --rm e2e-tests" / "docker compose run --rm api-tests", la misma fuente que alimenta Casos_de_Prueba_OrangeHRM.xlsx y los reportes de Allure):</w:t>
       </w:r>
     </w:p>
     <w:tbl>
@@ -7153,7 +7168,263 @@
                 <w:sz w:val="19"/>
                 <w:szCs w:val="19"/>
               </w:rPr>
-              <w:t xml:space="preserve">25</w:t>
+              <w:t xml:space="preserve">20</w:t>
+            </w:r>
+          </w:p>
+        </w:tc>
+        <w:tc>
+          <w:tcPr>
+            <w:tcW w:type="dxa" w:w="1300"/>
+            <w:shd w:fill="FEE2E2" w:color="auto" w:val="clear"/>
+            <w:tcMar>
+              <w:top w:type="dxa" w:w="60"/>
+              <w:left w:type="dxa" w:w="100"/>
+              <w:bottom w:type="dxa" w:w="60"/>
+              <w:right w:type="dxa" w:w="100"/>
+            </w:tcMar>
+            <w:vAlign w:val="center"/>
+          </w:tcPr>
+          <w:p>
+            <w:pPr>
+              <w:jc w:val="left"/>
+            </w:pPr>
+            <w:r>
+              <w:rPr>
+                <w:b w:val="false"/>
+                <w:bCs w:val="false"/>
+                <w:color w:val="991B1B"/>
+                <w:sz w:val="19"/>
+                <w:szCs w:val="19"/>
+              </w:rPr>
+              <w:t xml:space="preserve">4</w:t>
+            </w:r>
+          </w:p>
+        </w:tc>
+        <w:tc>
+          <w:tcPr>
+            <w:tcW w:type="dxa" w:w="1300"/>
+            <w:shd w:fill="FFFFFF" w:color="auto" w:val="clear"/>
+            <w:tcMar>
+              <w:top w:type="dxa" w:w="60"/>
+              <w:left w:type="dxa" w:w="100"/>
+              <w:bottom w:type="dxa" w:w="60"/>
+              <w:right w:type="dxa" w:w="100"/>
+            </w:tcMar>
+            <w:vAlign w:val="center"/>
+          </w:tcPr>
+          <w:p>
+            <w:pPr>
+              <w:jc w:val="left"/>
+            </w:pPr>
+            <w:r>
+              <w:rPr>
+                <w:b w:val="false"/>
+                <w:bCs w:val="false"/>
+                <w:color w:val="1F2937"/>
+                <w:sz w:val="19"/>
+                <w:szCs w:val="19"/>
+              </w:rPr>
+              <w:t xml:space="preserve">1</w:t>
+            </w:r>
+          </w:p>
+        </w:tc>
+      </w:tr>
+      <w:tr>
+        <w:tc>
+          <w:tcPr>
+            <w:tcW w:type="dxa" w:w="4400"/>
+            <w:shd w:fill="F5F3FF" w:color="auto" w:val="clear"/>
+            <w:tcMar>
+              <w:top w:type="dxa" w:w="60"/>
+              <w:left w:type="dxa" w:w="100"/>
+              <w:bottom w:type="dxa" w:w="60"/>
+              <w:right w:type="dxa" w:w="100"/>
+            </w:tcMar>
+            <w:vAlign w:val="center"/>
+          </w:tcPr>
+          <w:p>
+            <w:pPr>
+              <w:jc w:val="left"/>
+            </w:pPr>
+            <w:r>
+              <w:rPr>
+                <w:b w:val="false"/>
+                <w:bCs w:val="false"/>
+                <w:color w:val="1F2937"/>
+                <w:sz w:val="19"/>
+                <w:szCs w:val="19"/>
+              </w:rPr>
+              <w:t xml:space="preserve">Frontend – regresión adicional (CP-026 a CP-125, otros módulos OrangeHRM)</w:t>
+            </w:r>
+          </w:p>
+        </w:tc>
+        <w:tc>
+          <w:tcPr>
+            <w:tcW w:type="dxa" w:w="1300"/>
+            <w:shd w:fill="F5F3FF" w:color="auto" w:val="clear"/>
+            <w:tcMar>
+              <w:top w:type="dxa" w:w="60"/>
+              <w:left w:type="dxa" w:w="100"/>
+              <w:bottom w:type="dxa" w:w="60"/>
+              <w:right w:type="dxa" w:w="100"/>
+            </w:tcMar>
+            <w:vAlign w:val="center"/>
+          </w:tcPr>
+          <w:p>
+            <w:pPr>
+              <w:jc w:val="left"/>
+            </w:pPr>
+            <w:r>
+              <w:rPr>
+                <w:b w:val="false"/>
+                <w:bCs w:val="false"/>
+                <w:color w:val="1F2937"/>
+                <w:sz w:val="19"/>
+                <w:szCs w:val="19"/>
+              </w:rPr>
+              <w:t xml:space="preserve">100</w:t>
+            </w:r>
+          </w:p>
+        </w:tc>
+        <w:tc>
+          <w:tcPr>
+            <w:tcW w:type="dxa" w:w="1300"/>
+            <w:shd w:fill="FEF3C7" w:color="auto" w:val="clear"/>
+            <w:tcMar>
+              <w:top w:type="dxa" w:w="60"/>
+              <w:left w:type="dxa" w:w="100"/>
+              <w:bottom w:type="dxa" w:w="60"/>
+              <w:right w:type="dxa" w:w="100"/>
+            </w:tcMar>
+            <w:vAlign w:val="center"/>
+          </w:tcPr>
+          <w:p>
+            <w:pPr>
+              <w:jc w:val="left"/>
+            </w:pPr>
+            <w:r>
+              <w:rPr>
+                <w:b w:val="false"/>
+                <w:bCs w:val="false"/>
+                <w:color w:val="92400E"/>
+                <w:sz w:val="19"/>
+                <w:szCs w:val="19"/>
+              </w:rPr>
+              <w:t xml:space="preserve">55</w:t>
+            </w:r>
+          </w:p>
+        </w:tc>
+        <w:tc>
+          <w:tcPr>
+            <w:tcW w:type="dxa" w:w="1300"/>
+            <w:shd w:fill="FEE2E2" w:color="auto" w:val="clear"/>
+            <w:tcMar>
+              <w:top w:type="dxa" w:w="60"/>
+              <w:left w:type="dxa" w:w="100"/>
+              <w:bottom w:type="dxa" w:w="60"/>
+              <w:right w:type="dxa" w:w="100"/>
+            </w:tcMar>
+            <w:vAlign w:val="center"/>
+          </w:tcPr>
+          <w:p>
+            <w:pPr>
+              <w:jc w:val="left"/>
+            </w:pPr>
+            <w:r>
+              <w:rPr>
+                <w:b w:val="false"/>
+                <w:bCs w:val="false"/>
+                <w:color w:val="991B1B"/>
+                <w:sz w:val="19"/>
+                <w:szCs w:val="19"/>
+              </w:rPr>
+              <w:t xml:space="preserve">45</w:t>
+            </w:r>
+          </w:p>
+        </w:tc>
+        <w:tc>
+          <w:tcPr>
+            <w:tcW w:type="dxa" w:w="1300"/>
+            <w:shd w:fill="F5F3FF" w:color="auto" w:val="clear"/>
+            <w:tcMar>
+              <w:top w:type="dxa" w:w="60"/>
+              <w:left w:type="dxa" w:w="100"/>
+              <w:bottom w:type="dxa" w:w="60"/>
+              <w:right w:type="dxa" w:w="100"/>
+            </w:tcMar>
+            <w:vAlign w:val="center"/>
+          </w:tcPr>
+          <w:p>
+            <w:pPr>
+              <w:jc w:val="left"/>
+            </w:pPr>
+            <w:r>
+              <w:rPr>
+                <w:b w:val="false"/>
+                <w:bCs w:val="false"/>
+                <w:color w:val="1F2937"/>
+                <w:sz w:val="19"/>
+                <w:szCs w:val="19"/>
+              </w:rPr>
+              <w:t xml:space="preserve">0</w:t>
+            </w:r>
+          </w:p>
+        </w:tc>
+      </w:tr>
+      <w:tr>
+        <w:tc>
+          <w:tcPr>
+            <w:tcW w:type="dxa" w:w="4400"/>
+            <w:shd w:fill="FFFFFF" w:color="auto" w:val="clear"/>
+            <w:tcMar>
+              <w:top w:type="dxa" w:w="60"/>
+              <w:left w:type="dxa" w:w="100"/>
+              <w:bottom w:type="dxa" w:w="60"/>
+              <w:right w:type="dxa" w:w="100"/>
+            </w:tcMar>
+            <w:vAlign w:val="center"/>
+          </w:tcPr>
+          <w:p>
+            <w:pPr>
+              <w:jc w:val="left"/>
+            </w:pPr>
+            <w:r>
+              <w:rPr>
+                <w:b w:val="false"/>
+                <w:bCs w:val="false"/>
+                <w:color w:val="1F2937"/>
+                <w:sz w:val="19"/>
+                <w:szCs w:val="19"/>
+              </w:rPr>
+              <w:t xml:space="preserve">API del Clima – WeatherAPI.com (Actividad 3 · CP-API-001 a CP-API-020 vía Newman)</w:t>
+            </w:r>
+          </w:p>
+        </w:tc>
+        <w:tc>
+          <w:tcPr>
+            <w:tcW w:type="dxa" w:w="1300"/>
+            <w:shd w:fill="FFFFFF" w:color="auto" w:val="clear"/>
+            <w:tcMar>
+              <w:top w:type="dxa" w:w="60"/>
+              <w:left w:type="dxa" w:w="100"/>
+              <w:bottom w:type="dxa" w:w="60"/>
+              <w:right w:type="dxa" w:w="100"/>
+            </w:tcMar>
+            <w:vAlign w:val="center"/>
+          </w:tcPr>
+          <w:p>
+            <w:pPr>
+              <w:jc w:val="left"/>
+            </w:pPr>
+            <w:r>
+              <w:rPr>
+                <w:b w:val="false"/>
+                <w:bCs w:val="false"/>
+                <w:color w:val="1F2937"/>
+                <w:sz w:val="19"/>
+                <w:szCs w:val="19"/>
+              </w:rPr>
+              <w:t xml:space="preserve">20</w:t>
             </w:r>
           </w:p>
         </w:tc>
@@ -7181,6 +7452,34 @@
                 <w:sz w:val="19"/>
                 <w:szCs w:val="19"/>
               </w:rPr>
+              <w:t xml:space="preserve">20</w:t>
+            </w:r>
+          </w:p>
+        </w:tc>
+        <w:tc>
+          <w:tcPr>
+            <w:tcW w:type="dxa" w:w="1300"/>
+            <w:shd w:fill="DCFCE7" w:color="auto" w:val="clear"/>
+            <w:tcMar>
+              <w:top w:type="dxa" w:w="60"/>
+              <w:left w:type="dxa" w:w="100"/>
+              <w:bottom w:type="dxa" w:w="60"/>
+              <w:right w:type="dxa" w:w="100"/>
+            </w:tcMar>
+            <w:vAlign w:val="center"/>
+          </w:tcPr>
+          <w:p>
+            <w:pPr>
+              <w:jc w:val="left"/>
+            </w:pPr>
+            <w:r>
+              <w:rPr>
+                <w:b w:val="false"/>
+                <w:bCs w:val="false"/>
+                <w:color w:val="166534"/>
+                <w:sz w:val="19"/>
+                <w:szCs w:val="19"/>
+              </w:rPr>
               <w:t xml:space="preserve">0</w:t>
             </w:r>
           </w:p>
@@ -7239,7 +7538,7 @@
                 <w:sz w:val="19"/>
                 <w:szCs w:val="19"/>
               </w:rPr>
-              <w:t xml:space="preserve">Frontend – regresión adicional (CP-026 a CP-125, otros módulos OrangeHRM)</w:t>
+              <w:t xml:space="preserve">Total acumulado</w:t>
             </w:r>
           </w:p>
         </w:tc>
@@ -7267,63 +7566,7 @@
                 <w:sz w:val="19"/>
                 <w:szCs w:val="19"/>
               </w:rPr>
-              <w:t xml:space="preserve">100</w:t>
-            </w:r>
-          </w:p>
-        </w:tc>
-        <w:tc>
-          <w:tcPr>
-            <w:tcW w:type="dxa" w:w="1300"/>
-            <w:shd w:fill="DCFCE7" w:color="auto" w:val="clear"/>
-            <w:tcMar>
-              <w:top w:type="dxa" w:w="60"/>
-              <w:left w:type="dxa" w:w="100"/>
-              <w:bottom w:type="dxa" w:w="60"/>
-              <w:right w:type="dxa" w:w="100"/>
-            </w:tcMar>
-            <w:vAlign w:val="center"/>
-          </w:tcPr>
-          <w:p>
-            <w:pPr>
-              <w:jc w:val="left"/>
-            </w:pPr>
-            <w:r>
-              <w:rPr>
-                <w:b w:val="false"/>
-                <w:bCs w:val="false"/>
-                <w:color w:val="166534"/>
-                <w:sz w:val="19"/>
-                <w:szCs w:val="19"/>
-              </w:rPr>
-              <w:t xml:space="preserve">~96</w:t>
-            </w:r>
-          </w:p>
-        </w:tc>
-        <w:tc>
-          <w:tcPr>
-            <w:tcW w:type="dxa" w:w="1300"/>
-            <w:shd w:fill="FEF3C7" w:color="auto" w:val="clear"/>
-            <w:tcMar>
-              <w:top w:type="dxa" w:w="60"/>
-              <w:left w:type="dxa" w:w="100"/>
-              <w:bottom w:type="dxa" w:w="60"/>
-              <w:right w:type="dxa" w:w="100"/>
-            </w:tcMar>
-            <w:vAlign w:val="center"/>
-          </w:tcPr>
-          <w:p>
-            <w:pPr>
-              <w:jc w:val="left"/>
-            </w:pPr>
-            <w:r>
-              <w:rPr>
-                <w:b w:val="false"/>
-                <w:bCs w:val="false"/>
-                <w:color w:val="92400E"/>
-                <w:sz w:val="19"/>
-                <w:szCs w:val="19"/>
-              </w:rPr>
-              <w:t xml:space="preserve">~4</w:t>
+              <w:t xml:space="preserve">145</w:t>
             </w:r>
           </w:p>
         </w:tc>
@@ -7347,183 +7590,11 @@
               <w:rPr>
                 <w:b w:val="false"/>
                 <w:bCs w:val="false"/>
-                <w:color w:val="1F2937"/>
-                <w:sz w:val="19"/>
-                <w:szCs w:val="19"/>
-              </w:rPr>
-              <w:t xml:space="preserve">0</w:t>
-            </w:r>
-          </w:p>
-        </w:tc>
-      </w:tr>
-      <w:tr>
-        <w:tc>
-          <w:tcPr>
-            <w:tcW w:type="dxa" w:w="4400"/>
-            <w:shd w:fill="FFFFFF" w:color="auto" w:val="clear"/>
-            <w:tcMar>
-              <w:top w:type="dxa" w:w="60"/>
-              <w:left w:type="dxa" w:w="100"/>
-              <w:bottom w:type="dxa" w:w="60"/>
-              <w:right w:type="dxa" w:w="100"/>
-            </w:tcMar>
-            <w:vAlign w:val="center"/>
-          </w:tcPr>
-          <w:p>
-            <w:pPr>
-              <w:jc w:val="left"/>
-            </w:pPr>
-            <w:r>
-              <w:rPr>
-                <w:b w:val="false"/>
-                <w:bCs w:val="false"/>
-                <w:color w:val="1F2937"/>
-                <w:sz w:val="19"/>
-                <w:szCs w:val="19"/>
-              </w:rPr>
-              <w:t xml:space="preserve">API del Clima – WeatherAPI.com (Actividad 3 · CP-API-001 a CP-API-020 vía Newman)</w:t>
-            </w:r>
-          </w:p>
-        </w:tc>
-        <w:tc>
-          <w:tcPr>
-            <w:tcW w:type="dxa" w:w="1300"/>
-            <w:shd w:fill="FFFFFF" w:color="auto" w:val="clear"/>
-            <w:tcMar>
-              <w:top w:type="dxa" w:w="60"/>
-              <w:left w:type="dxa" w:w="100"/>
-              <w:bottom w:type="dxa" w:w="60"/>
-              <w:right w:type="dxa" w:w="100"/>
-            </w:tcMar>
-            <w:vAlign w:val="center"/>
-          </w:tcPr>
-          <w:p>
-            <w:pPr>
-              <w:jc w:val="left"/>
-            </w:pPr>
-            <w:r>
-              <w:rPr>
-                <w:b w:val="false"/>
-                <w:bCs w:val="false"/>
-                <w:color w:val="1F2937"/>
-                <w:sz w:val="19"/>
-                <w:szCs w:val="19"/>
-              </w:rPr>
-              <w:t xml:space="preserve">20</w:t>
-            </w:r>
-          </w:p>
-        </w:tc>
-        <w:tc>
-          <w:tcPr>
-            <w:tcW w:type="dxa" w:w="1300"/>
-            <w:shd w:fill="DCFCE7" w:color="auto" w:val="clear"/>
-            <w:tcMar>
-              <w:top w:type="dxa" w:w="60"/>
-              <w:left w:type="dxa" w:w="100"/>
-              <w:bottom w:type="dxa" w:w="60"/>
-              <w:right w:type="dxa" w:w="100"/>
-            </w:tcMar>
-            <w:vAlign w:val="center"/>
-          </w:tcPr>
-          <w:p>
-            <w:pPr>
-              <w:jc w:val="left"/>
-            </w:pPr>
-            <w:r>
-              <w:rPr>
-                <w:b w:val="false"/>
-                <w:bCs w:val="false"/>
                 <w:color w:val="166534"/>
                 <w:sz w:val="19"/>
                 <w:szCs w:val="19"/>
               </w:rPr>
-              <w:t xml:space="preserve">20</w:t>
-            </w:r>
-          </w:p>
-        </w:tc>
-        <w:tc>
-          <w:tcPr>
-            <w:tcW w:type="dxa" w:w="1300"/>
-            <w:shd w:fill="DCFCE7" w:color="auto" w:val="clear"/>
-            <w:tcMar>
-              <w:top w:type="dxa" w:w="60"/>
-              <w:left w:type="dxa" w:w="100"/>
-              <w:bottom w:type="dxa" w:w="60"/>
-              <w:right w:type="dxa" w:w="100"/>
-            </w:tcMar>
-            <w:vAlign w:val="center"/>
-          </w:tcPr>
-          <w:p>
-            <w:pPr>
-              <w:jc w:val="left"/>
-            </w:pPr>
-            <w:r>
-              <w:rPr>
-                <w:b w:val="false"/>
-                <w:bCs w:val="false"/>
-                <w:color w:val="166534"/>
-                <w:sz w:val="19"/>
-                <w:szCs w:val="19"/>
-              </w:rPr>
-              <w:t xml:space="preserve">0</w:t>
-            </w:r>
-          </w:p>
-        </w:tc>
-        <w:tc>
-          <w:tcPr>
-            <w:tcW w:type="dxa" w:w="1300"/>
-            <w:shd w:fill="FFFFFF" w:color="auto" w:val="clear"/>
-            <w:tcMar>
-              <w:top w:type="dxa" w:w="60"/>
-              <w:left w:type="dxa" w:w="100"/>
-              <w:bottom w:type="dxa" w:w="60"/>
-              <w:right w:type="dxa" w:w="100"/>
-            </w:tcMar>
-            <w:vAlign w:val="center"/>
-          </w:tcPr>
-          <w:p>
-            <w:pPr>
-              <w:jc w:val="left"/>
-            </w:pPr>
-            <w:r>
-              <w:rPr>
-                <w:b w:val="false"/>
-                <w:bCs w:val="false"/>
-                <w:color w:val="1F2937"/>
-                <w:sz w:val="19"/>
-                <w:szCs w:val="19"/>
-              </w:rPr>
-              <w:t xml:space="preserve">0</w:t>
-            </w:r>
-          </w:p>
-        </w:tc>
-      </w:tr>
-      <w:tr>
-        <w:tc>
-          <w:tcPr>
-            <w:tcW w:type="dxa" w:w="4400"/>
-            <w:shd w:fill="F5F3FF" w:color="auto" w:val="clear"/>
-            <w:tcMar>
-              <w:top w:type="dxa" w:w="60"/>
-              <w:left w:type="dxa" w:w="100"/>
-              <w:bottom w:type="dxa" w:w="60"/>
-              <w:right w:type="dxa" w:w="100"/>
-            </w:tcMar>
-            <w:vAlign w:val="center"/>
-          </w:tcPr>
-          <w:p>
-            <w:pPr>
-              <w:jc w:val="left"/>
-            </w:pPr>
-            <w:r>
-              <w:rPr>
-                <w:b w:val="false"/>
-                <w:bCs w:val="false"/>
-                <w:color w:val="1F2937"/>
-                <w:sz w:val="19"/>
-                <w:szCs w:val="19"/>
-              </w:rPr>
-              <w:t xml:space="preserve">Total acumulado</w:t>
+              <w:t xml:space="preserve">95</w:t>
             </w:r>
           </w:p>
         </w:tc>
@@ -7547,11 +7618,11 @@
               <w:rPr>
                 <w:b w:val="false"/>
                 <w:bCs w:val="false"/>
-                <w:color w:val="1F2937"/>
-                <w:sz w:val="19"/>
-                <w:szCs w:val="19"/>
-              </w:rPr>
-              <w:t xml:space="preserve">145</w:t>
+                <w:color w:val="991B1B"/>
+                <w:sz w:val="19"/>
+                <w:szCs w:val="19"/>
+              </w:rPr>
+              <w:t xml:space="preserve">49</w:t>
             </w:r>
           </w:p>
         </w:tc>
@@ -7575,72 +7646,36 @@
               <w:rPr>
                 <w:b w:val="false"/>
                 <w:bCs w:val="false"/>
-                <w:color w:val="166534"/>
-                <w:sz w:val="19"/>
-                <w:szCs w:val="19"/>
-              </w:rPr>
-              <w:t xml:space="preserve">~141</w:t>
-            </w:r>
-          </w:p>
-        </w:tc>
-        <w:tc>
-          <w:tcPr>
-            <w:tcW w:type="dxa" w:w="1300"/>
-            <w:shd w:fill="F5F3FF" w:color="auto" w:val="clear"/>
-            <w:tcMar>
-              <w:top w:type="dxa" w:w="60"/>
-              <w:left w:type="dxa" w:w="100"/>
-              <w:bottom w:type="dxa" w:w="60"/>
-              <w:right w:type="dxa" w:w="100"/>
-            </w:tcMar>
-            <w:vAlign w:val="center"/>
-          </w:tcPr>
-          <w:p>
-            <w:pPr>
-              <w:jc w:val="left"/>
-            </w:pPr>
-            <w:r>
-              <w:rPr>
-                <w:b w:val="false"/>
-                <w:bCs w:val="false"/>
-                <w:color w:val="92400E"/>
-                <w:sz w:val="19"/>
-                <w:szCs w:val="19"/>
-              </w:rPr>
-              <w:t xml:space="preserve">~4</w:t>
-            </w:r>
-          </w:p>
-        </w:tc>
-        <w:tc>
-          <w:tcPr>
-            <w:tcW w:type="dxa" w:w="1300"/>
-            <w:shd w:fill="F5F3FF" w:color="auto" w:val="clear"/>
-            <w:tcMar>
-              <w:top w:type="dxa" w:w="60"/>
-              <w:left w:type="dxa" w:w="100"/>
-              <w:bottom w:type="dxa" w:w="60"/>
-              <w:right w:type="dxa" w:w="100"/>
-            </w:tcMar>
-            <w:vAlign w:val="center"/>
-          </w:tcPr>
-          <w:p>
-            <w:pPr>
-              <w:jc w:val="left"/>
-            </w:pPr>
-            <w:r>
-              <w:rPr>
-                <w:b w:val="false"/>
-                <w:bCs w:val="false"/>
-                <w:color w:val="1F2937"/>
-                <w:sz w:val="19"/>
-                <w:szCs w:val="19"/>
-              </w:rPr>
-              <w:t xml:space="preserve">0</w:t>
+                <w:color w:val="1F2937"/>
+                <w:sz w:val="19"/>
+                <w:szCs w:val="19"/>
+              </w:rPr>
+              <w:t xml:space="preserve">1</w:t>
             </w:r>
           </w:p>
         </w:tc>
       </w:tr>
     </w:tbl>
+    <w:p>
+      <w:pPr>
+        <w:spacing w:after="160"/>
+      </w:pPr>
+    </w:p>
+    <w:p>
+      <w:pPr>
+        <w:spacing w:after="120"/>
+      </w:pPr>
+      <w:r>
+        <w:rPr>
+          <w:i/>
+          <w:iCs/>
+          <w:color w:val="6B7280"/>
+          <w:sz w:val="19"/>
+          <w:szCs w:val="19"/>
+        </w:rPr>
+        <w:t xml:space="preserve">Lectura de los resultados: los 25 casos núcleo de Actividad 2 (Sprint N, N+1 y N+2) tienen una tasa de éxito del 80% (20/25); el detalle de las 4 fallas y 1 caso saltado está documentado en la sección b) junto a cada sprint. La suite de regresión adicional (CP-026 a CP-125, 100 casos sobre módulos como Leave, Buzz, Recruitment, Directory, Dashboard, Time &amp; Attendance, etc.) muestra una tasa de éxito menor (55%): la gran mayoría de sus fallas son "page.goto: Timeout" / "Timed out waiting for locator" (la suite corre contra el demo público compartido opensource-demo.orangehrmlive.com, que responde con latencia variable bajo carga) y "strict mode violation" por selectores que matchean más de un elemento tras cambios recientes del DOM — ambas son deuda de mantenimiento de la automatización (ajuste de selectores y timeouts), no defectos de producto. Quedan registradas como acción de seguimiento para la siguiente iteración de estabilización de la suite.</w:t>
+      </w:r>
+    </w:p>
     <w:p>
       <w:pPr>
         <w:spacing w:after="120"/>
@@ -7654,6 +7689,21 @@
           <w:szCs w:val="19"/>
         </w:rPr>
         <w:t xml:space="preserve">Los reportes detallados por caso (con capturas, video y traza de cada ejecución) están disponibles en Allure (http://localhost:5050) y en el reporte HTML de Playwright (http://localhost:8080) luego de correr "bash start.sh test". El detalle caso-por-caso también puede exportarse a planilla con "bash start.sh excel" (Casos_de_Prueba_OrangeHRM.xlsx), que incluye además, para cada caso fallido, una columna con la descripción del fallo en lenguaje simple lista para volcar a una tarjeta de Trello.</w:t>
+      </w:r>
+    </w:p>
+    <w:p>
+      <w:pPr>
+        <w:spacing w:after="120"/>
+      </w:pPr>
+      <w:r>
+        <w:rPr>
+          <w:i/>
+          <w:iCs/>
+          <w:color w:val="6B7280"/>
+          <w:sz w:val="19"/>
+          <w:szCs w:val="19"/>
+        </w:rPr>
+        <w:t xml:space="preserve">Última corrida verificada de la suite de API (Newman, dentro de Docker, vía "docker compose run --rm api-tests"): 20/20 requests OK y 54/54 assertions pasadas, 0 fallos, en ≈ 3.6 segundos. Esa corrida quedó estable luego de resolver dos problemas de infraestructura que impedían su ejecución: (1) el flag "--insecure" de Newman, necesario porque la red intercepta el tráfico HTTPS y rompe la cadena de certificados (mismo problema que ya resuelven los Dockerfiles para npm con "strict-ssl false"); y (2) el flag "--env-var \"api_key=$WEATHER_API_KEY\"", que sobrescribe en tiempo de ejecución el valor de la variable api_key — el placeholder original "{{$processEnv WEATHER_API_KEY}}" del archivo de entorno de Postman no se resuelve quedando como texto literal al usarse como valor estático de otra variable, por lo que la key nunca llegaba a las requests.</w:t>
       </w:r>
     </w:p>
     <w:p>
@@ -8933,7 +8983,7 @@
           <w:sz w:val="21"/>
           <w:szCs w:val="21"/>
         </w:rPr>
-        <w:t xml:space="preserve">Las funcionalidades núcleo de los Sprints N, N+1 y N+2 (Actividad 2) cerraron con el 100% de los casos de prueba diseñados en estado "PASÓ" tras la corrección de los selectores de automatización.</w:t>
+        <w:t xml:space="preserve">Las funcionalidades núcleo de los Sprints N, N+1 y N+2 (Actividad 2, CP-001 a CP-025) alcanzaron una tasa de éxito del 80% (20/25 PASÓ) en la última corrida. Los 4 casos fallidos y el caso saltado están detallados junto a cada sprint en la sección b): combinan timeouts intermitentes contra el demo público compartido, una "strict mode violation" de selector y dos assertions a revisar — ninguno compromete el flujo principal de las pantallas evaluadas, pero quedan como acción de seguimiento para estabilizar la suite.</w:t>
       </w:r>
     </w:p>
     <w:p>
@@ -8967,7 +9017,24 @@
           <w:sz w:val="21"/>
           <w:szCs w:val="21"/>
         </w:rPr>
-        <w:t xml:space="preserve">La integración con la Weather API (Actividad 3) pasó el 100% de los 20 casos diseñados, validando tanto los caminos felices como el manejo de errores (401, 403, 400) de los 4 endpoints utilizados por el widget.</w:t>
+        <w:t xml:space="preserve">La suite de regresión adicional (CP-026 a CP-125, 100 casos sobre otros módulos de OrangeHRM) registró 55/100 PASÓ en la última corrida; el análisis de las fallas (ver sección d.1) muestra que son mayormente "timeouts" por la latencia variable del demo público y "strict mode violations" de selectores — deuda de mantenimiento de automatización a resolver en la próxima iteración, no bugs de producto nuevos.</w:t>
+      </w:r>
+    </w:p>
+    <w:p>
+      <w:pPr>
+        <w:pStyle w:val="ListParagraph"/>
+        <w:numPr>
+          <w:ilvl w:val="0"/>
+          <w:numId w:val="1"/>
+        </w:numPr>
+        <w:spacing w:after="60"/>
+      </w:pPr>
+      <w:r>
+        <w:rPr>
+          <w:sz w:val="21"/>
+          <w:szCs w:val="21"/>
+        </w:rPr>
+        <w:t xml:space="preserve">La integración con la Weather API (Actividad 3) pasó el 100% de los 20 casos diseñados (54/54 assertions), validando tanto los caminos felices como el manejo de errores (401, 400) de los 4 endpoints utilizados por el widget. Durante la verificación se ajustó CP-API-004: WeatherAPI.com cambió el código de respuesta para API key inválida de 403 a 401, por lo que el caso y su assertion se actualizaron para reflejar el comportamiento real y vigente de la API.</w:t>
       </w:r>
     </w:p>
     <w:p>

</xml_diff>